<commit_message>
T4.2 fix DMP: R1 licence CC0, update Section 3a storage description
</commit_message>
<xml_diff>
--- a/docs/DMP_Frost_Day_Prediction_in_Vienna.docx
+++ b/docs/DMP_Frost_Day_Prediction_in_Vienna.docx
@@ -91,12 +91,6 @@
           <w:lang w:val="en-GB"/>
         </w:rPr>
         <w:t>:</w:t>
-      </w:r>
-      <w:r>
-        <w:rPr>
-          <w:rFonts w:cstheme="minorHAnsi"/>
-          <w:lang w:val="en-GB"/>
-        </w:rPr>
         <w:tab/>
         <w:t>Read everything carefully and adjust automatically generated text if necessary.</w:t>
       </w:r>
@@ -133,12 +127,6 @@
           <w:lang w:val="en-GB"/>
         </w:rPr>
         <w:t>:</w:t>
-      </w:r>
-      <w:r>
-        <w:rPr>
-          <w:rFonts w:cstheme="minorHAnsi"/>
-          <w:lang w:val="en-GB"/>
-        </w:rPr>
         <w:tab/>
         <w:t xml:space="preserve">Content in </w:t>
       </w:r>
@@ -155,63 +143,7 @@
           <w:rFonts w:cstheme="minorHAnsi"/>
           <w:lang w:val="en-GB"/>
         </w:rPr>
-        <w:t xml:space="preserve"> and in […] needs extra attention. Check and add missing information. Delete the square brackets and change the font colour to black. E</w:t>
-      </w:r>
-      <w:r>
-        <w:rPr>
-          <w:rFonts w:cstheme="minorHAnsi"/>
-          <w:lang w:val="en-GB"/>
-        </w:rPr>
-        <w:t>XAMPLE 1</w:t>
-      </w:r>
-      <w:r>
-        <w:rPr>
-          <w:rFonts w:cstheme="minorHAnsi"/>
-          <w:lang w:val="en-GB"/>
-        </w:rPr>
-        <w:t xml:space="preserve">: </w:t>
-      </w:r>
-      <w:r>
-        <w:rPr>
-          <w:rFonts w:cstheme="minorHAnsi"/>
-          <w:lang w:val="en-GB"/>
-        </w:rPr>
-        <w:t>Deliverable information</w:t>
-      </w:r>
-      <w:r>
-        <w:rPr>
-          <w:rFonts w:cstheme="minorHAnsi"/>
-          <w:lang w:val="en-GB"/>
-        </w:rPr>
-        <w:t xml:space="preserve"> </w:t>
-      </w:r>
-      <w:r>
-        <w:rPr>
-          <w:rFonts w:cstheme="minorHAnsi"/>
-          <w:lang w:val="en-GB"/>
-        </w:rPr>
-        <w:t>on the cover page.</w:t>
-      </w:r>
-      <w:r>
-        <w:rPr>
-          <w:rFonts w:cstheme="minorHAnsi"/>
-          <w:lang w:val="en-GB"/>
-        </w:rPr>
-        <w:t xml:space="preserve"> EXAMPLE 2: README file level </w:t>
-      </w:r>
-      <w:r>
-        <w:rPr>
-          <w:rFonts w:cstheme="minorHAnsi"/>
-          <w:lang w:val="en-GB"/>
-        </w:rPr>
-        <w:t>in section 2</w:t>
-      </w:r>
-      <w:r>
-        <w:rPr>
-          <w:rFonts w:cstheme="minorHAnsi"/>
-          <w:lang w:val="en-GB"/>
-        </w:rPr>
-        <w:t>.1 - choose one and delete the other options.</w:t>
+        <w:t xml:space="preserve"> and in […] needs extra attention. Check and add missing information. Delete the square brackets and change the font colour to black. EXAMPLE 1: Deliverable information on the cover page. EXAMPLE 2: README file level in section 2.1 - choose one and delete the other options.</w:t>
       </w:r>
     </w:p>
     <w:p>
@@ -246,35 +178,8 @@
           <w:lang w:val="en-GB"/>
         </w:rPr>
         <w:t>:</w:t>
-      </w:r>
-      <w:r>
-        <w:rPr>
-          <w:rFonts w:cstheme="minorHAnsi"/>
-          <w:lang w:val="en-GB"/>
-        </w:rPr>
         <w:tab/>
-        <w:t xml:space="preserve">Fill in missing information. </w:t>
-      </w:r>
-      <w:r>
-        <w:rPr>
-          <w:rFonts w:cstheme="minorHAnsi"/>
-          <w:lang w:val="en-GB"/>
-        </w:rPr>
-        <w:t xml:space="preserve">EXAMPLE: Add specific acronyms used in the DMP </w:t>
-      </w:r>
-      <w:r>
-        <w:rPr>
-          <w:rFonts w:cstheme="minorHAnsi"/>
-          <w:lang w:val="en-GB"/>
-        </w:rPr>
-        <w:t>in the Terminology section</w:t>
-      </w:r>
-      <w:r>
-        <w:rPr>
-          <w:rFonts w:cstheme="minorHAnsi"/>
-          <w:lang w:val="en-GB"/>
-        </w:rPr>
-        <w:t xml:space="preserve"> on page 2. </w:t>
+        <w:t xml:space="preserve">Fill in missing information. EXAMPLE: Add specific acronyms used in the DMP in the Terminology section on page 2. </w:t>
       </w:r>
     </w:p>
     <w:p>
@@ -301,14 +206,6 @@
           <w:lang w:val="en-GB"/>
         </w:rPr>
         <w:t>Delete (1):</w:t>
-      </w:r>
-      <w:r>
-        <w:rPr>
-          <w:rFonts w:cstheme="minorHAnsi"/>
-          <w:b/>
-          <w:bCs/>
-          <w:lang w:val="en-GB"/>
-        </w:rPr>
         <w:tab/>
         <w:t xsi:nil="true"/>
       </w:r>
@@ -344,33 +241,7 @@
           <w:bCs/>
           <w:lang w:val="en-GB"/>
         </w:rPr>
-        <w:t xml:space="preserve">Delete </w:t>
-      </w:r>
-      <w:r>
-        <w:rPr>
-          <w:rFonts w:cstheme="minorHAnsi"/>
-          <w:b/>
-          <w:bCs/>
-          <w:lang w:val="en-GB"/>
-        </w:rPr>
-        <w:t>(2)</w:t>
-      </w:r>
-      <w:r>
-        <w:rPr>
-          <w:rFonts w:cstheme="minorHAnsi"/>
-          <w:b/>
-          <w:bCs/>
-          <w:lang w:val="en-GB"/>
-        </w:rPr>
-        <w:t>:</w:t>
-      </w:r>
-      <w:r>
-        <w:rPr>
-          <w:rFonts w:cstheme="minorHAnsi"/>
-          <w:b/>
-          <w:bCs/>
-          <w:lang w:val="en-GB"/>
-        </w:rPr>
+        <w:t>Delete (2):</w:t>
         <w:tab/>
         <w:t xsi:nil="true"/>
       </w:r>
@@ -379,28 +250,7 @@
           <w:rFonts w:cstheme="minorHAnsi"/>
           <w:lang w:val="en-GB"/>
         </w:rPr>
-        <w:t>D</w:t>
-      </w:r>
-      <w:r>
-        <w:rPr>
-          <w:rFonts w:cstheme="minorHAnsi"/>
-          <w:lang w:val="en-GB"/>
-        </w:rPr>
-        <w:t xml:space="preserve">elete this </w:t>
-      </w:r>
-      <w:r>
-        <w:rPr>
-          <w:rFonts w:cstheme="minorHAnsi"/>
-          <w:lang w:val="en-GB"/>
-        </w:rPr>
-        <w:t xml:space="preserve">instruction </w:t>
-      </w:r>
-      <w:r>
-        <w:rPr>
-          <w:rFonts w:cstheme="minorHAnsi"/>
-          <w:lang w:val="en-GB"/>
-        </w:rPr>
-        <w:t xml:space="preserve">page. </w:t>
+        <w:t xml:space="preserve">Delete this instruction page. </w:t>
       </w:r>
     </w:p>
     <w:p>
@@ -435,12 +285,6 @@
           <w:lang w:val="en-GB"/>
         </w:rPr>
         <w:t xml:space="preserve"> </w:t>
-      </w:r>
-      <w:r>
-        <w:rPr>
-          <w:rFonts w:cstheme="minorHAnsi"/>
-          <w:lang w:val="en-GB"/>
-        </w:rPr>
         <w:tab/>
         <w:t xml:space="preserve">Update the table of contents. </w:t>
       </w:r>
@@ -553,8 +397,6 @@
           <w:color w:val="000000" w:themeColor="text1"/>
         </w:rPr>
       </w:pPr>
-      <w:proofErr w:type="spellStart"/>
-      <w:proofErr w:type="spellEnd"/>
       <w:r>
         <w:rPr>
           <w:b/>
@@ -1081,24 +923,8 @@
               <w:rPr>
                 <w:rFonts w:eastAsia="Arial"/>
               </w:rPr>
-              <w:t xml:space="preserve">This </w:t>
-            </w:r>
-            <w:proofErr w:type="gramStart"/>
-            <w:r>
-              <w:rPr>
-                <w:rFonts w:eastAsia="Arial"/>
-              </w:rPr>
-              <w:t>deliverable</w:t>
-            </w:r>
-            <w:proofErr w:type="gramEnd"/>
-            <w:r>
-              <w:rPr>
-                <w:rFonts w:eastAsia="Arial"/>
-              </w:rPr>
-              <w:t xml:space="preserve"> is the initial Data Management Plan (DMP) for t</w:t>
-            </w:r>
-            <w:proofErr w:type="spellStart"/>
-            <w:proofErr w:type="spellEnd"/>
+              <w:t>This deliverable is the initial Data Management Plan (DMP) for t</w:t>
+            </w:r>
             <w:r>
               <w:rPr>
                 <w:rFonts w:eastAsia="Arial"/>
@@ -1230,8 +1056,6 @@
         </w:drawing>
         <w:t xsi:nil="true"/>
       </w:r>
-      <w:proofErr w:type="spellStart"/>
-      <w:proofErr w:type="spellEnd"/>
       <w:r>
         <w:rPr>
           <w:color w:val="000000" w:themeColor="text1"/>
@@ -1248,35 +1072,11 @@
           <w:t>http://creativecommons.org/licenses/by/4.0/</w:t>
         </w:r>
       </w:hyperlink>
-      <w:proofErr w:type="spellStart"/>
-      <w:proofErr w:type="spellEnd"/>
       <w:r>
         <w:rPr>
           <w:color w:val="000000" w:themeColor="text1"/>
         </w:rPr>
-        <w:t xml:space="preserve">). The Frost Day Prediction in Vienna project is funded by the European Union Horizon Europe </w:t>
-      </w:r>
-      <w:proofErr w:type="spellStart"/>
-      <w:r>
-        <w:rPr>
-          <w:color w:val="000000" w:themeColor="text1"/>
-        </w:rPr>
-        <w:t>programme</w:t>
-      </w:r>
-      <w:proofErr w:type="spellEnd"/>
-      <w:r>
-        <w:rPr>
-          <w:color w:val="000000" w:themeColor="text1"/>
-        </w:rPr>
-        <w:t xml:space="preserve"> under Grant Agreement No </w:t>
-      </w:r>
-      <w:proofErr w:type="spellStart"/>
-      <w:proofErr w:type="spellEnd"/>
-      <w:r>
-        <w:rPr>
-          <w:color w:val="000000" w:themeColor="text1"/>
-        </w:rPr>
-        <w:t>.</w:t>
+        <w:t>). The Frost Day Prediction in Vienna project is funded by the European Union Horizon Europe programme under Grant Agreement No .</w:t>
       </w:r>
     </w:p>
     <w:p>
@@ -2096,10 +1896,6 @@
                 <w:szCs w:val="20"/>
               </w:rPr>
             </w:pPr>
-            <w:proofErr w:type="spellStart"/>
-            <w:proofErr w:type="gramStart"/>
-            <w:proofErr w:type="spellEnd"/>
-            <w:proofErr w:type="gramEnd"/>
             <w:r>
               <w:rPr>
                 <w:color w:val="92D050"/>
@@ -2851,15 +2647,6 @@
                 <w:lang w:val="en-GB"/>
               </w:rPr>
               <w:t>Project Coordinator</w:t>
-            </w:r>
-            <w:r>
-              <w:rPr>
-                <w:bCs/>
-                <w:color w:val="auto"/>
-                <w:sz w:val="20"/>
-                <w:szCs w:val="20"/>
-                <w:lang w:val="en-GB"/>
-              </w:rPr>
               <w:br/>
               <w:t>Principal Investigator</w:t>
             </w:r>
@@ -3031,7 +2818,6 @@
                 <w:szCs w:val="20"/>
                 <w:lang w:val="en-GB"/>
               </w:rPr>
-              <w:t/>
               <w:t>Vivek Sharma, ORCID: 0009-0006-4879-6388, Maharishi Markandeshwar University, Mullana, Researcher</w:t>
               <w:br/>
               <w:br/>
@@ -3114,21 +2900,7 @@
               <w:color w:val="auto"/>
             </w:rPr>
             <w:fldChar w:fldCharType="begin"/>
-          </w:r>
-          <w:r>
-            <w:rPr>
-              <w:rFonts w:eastAsiaTheme="minorHAnsi"/>
-              <w:noProof/>
-              <w:color w:val="auto"/>
-            </w:rPr>
             <w:instrText xml:space="preserve"> TOC \o "1-3" \h \z \u </w:instrText>
-          </w:r>
-          <w:r>
-            <w:rPr>
-              <w:rFonts w:eastAsiaTheme="minorHAnsi"/>
-              <w:noProof/>
-              <w:color w:val="auto"/>
-            </w:rPr>
             <w:fldChar w:fldCharType="separate"/>
           </w:r>
           <w:hyperlink w:anchor="_Toc156287338" w:history="1">
@@ -3165,46 +2937,10 @@
                 <w:webHidden/>
               </w:rPr>
               <w:tab/>
-            </w:r>
-            <w:r>
-              <w:rPr>
-                <w:noProof/>
-                <w:webHidden/>
-              </w:rPr>
               <w:fldChar w:fldCharType="begin"/>
-            </w:r>
-            <w:r>
-              <w:rPr>
-                <w:noProof/>
-                <w:webHidden/>
-              </w:rPr>
               <w:instrText xml:space="preserve"> PAGEREF _Toc156287338 \h </w:instrText>
-            </w:r>
-            <w:r>
-              <w:rPr>
-                <w:noProof/>
-                <w:webHidden/>
-              </w:rPr>
-            </w:r>
-            <w:r>
-              <w:rPr>
-                <w:noProof/>
-                <w:webHidden/>
-              </w:rPr>
               <w:fldChar w:fldCharType="separate"/>
-            </w:r>
-            <w:r>
-              <w:rPr>
-                <w:noProof/>
-                <w:webHidden/>
-              </w:rPr>
               <w:t>5</w:t>
-            </w:r>
-            <w:r>
-              <w:rPr>
-                <w:noProof/>
-                <w:webHidden/>
-              </w:rPr>
               <w:fldChar w:fldCharType="end"/>
             </w:r>
           </w:hyperlink>
@@ -3255,46 +2991,10 @@
                 <w:webHidden/>
               </w:rPr>
               <w:tab/>
-            </w:r>
-            <w:r>
-              <w:rPr>
-                <w:noProof/>
-                <w:webHidden/>
-              </w:rPr>
               <w:fldChar w:fldCharType="begin"/>
-            </w:r>
-            <w:r>
-              <w:rPr>
-                <w:noProof/>
-                <w:webHidden/>
-              </w:rPr>
               <w:instrText xml:space="preserve"> PAGEREF _Toc156287339 \h </w:instrText>
-            </w:r>
-            <w:r>
-              <w:rPr>
-                <w:noProof/>
-                <w:webHidden/>
-              </w:rPr>
-            </w:r>
-            <w:r>
-              <w:rPr>
-                <w:noProof/>
-                <w:webHidden/>
-              </w:rPr>
               <w:fldChar w:fldCharType="separate"/>
-            </w:r>
-            <w:r>
-              <w:rPr>
-                <w:noProof/>
-                <w:webHidden/>
-              </w:rPr>
               <w:t>5</w:t>
-            </w:r>
-            <w:r>
-              <w:rPr>
-                <w:noProof/>
-                <w:webHidden/>
-              </w:rPr>
               <w:fldChar w:fldCharType="end"/>
             </w:r>
           </w:hyperlink>
@@ -3345,46 +3045,10 @@
                 <w:webHidden/>
               </w:rPr>
               <w:tab/>
-            </w:r>
-            <w:r>
-              <w:rPr>
-                <w:noProof/>
-                <w:webHidden/>
-              </w:rPr>
               <w:fldChar w:fldCharType="begin"/>
-            </w:r>
-            <w:r>
-              <w:rPr>
-                <w:noProof/>
-                <w:webHidden/>
-              </w:rPr>
               <w:instrText xml:space="preserve"> PAGEREF _Toc156287340 \h </w:instrText>
-            </w:r>
-            <w:r>
-              <w:rPr>
-                <w:noProof/>
-                <w:webHidden/>
-              </w:rPr>
-            </w:r>
-            <w:r>
-              <w:rPr>
-                <w:noProof/>
-                <w:webHidden/>
-              </w:rPr>
               <w:fldChar w:fldCharType="separate"/>
-            </w:r>
-            <w:r>
-              <w:rPr>
-                <w:noProof/>
-                <w:webHidden/>
-              </w:rPr>
               <w:t>5</w:t>
-            </w:r>
-            <w:r>
-              <w:rPr>
-                <w:noProof/>
-                <w:webHidden/>
-              </w:rPr>
               <w:fldChar w:fldCharType="end"/>
             </w:r>
           </w:hyperlink>
@@ -3435,46 +3099,10 @@
                 <w:webHidden/>
               </w:rPr>
               <w:tab/>
-            </w:r>
-            <w:r>
-              <w:rPr>
-                <w:noProof/>
-                <w:webHidden/>
-              </w:rPr>
               <w:fldChar w:fldCharType="begin"/>
-            </w:r>
-            <w:r>
-              <w:rPr>
-                <w:noProof/>
-                <w:webHidden/>
-              </w:rPr>
               <w:instrText xml:space="preserve"> PAGEREF _Toc156287341 \h </w:instrText>
-            </w:r>
-            <w:r>
-              <w:rPr>
-                <w:noProof/>
-                <w:webHidden/>
-              </w:rPr>
-            </w:r>
-            <w:r>
-              <w:rPr>
-                <w:noProof/>
-                <w:webHidden/>
-              </w:rPr>
               <w:fldChar w:fldCharType="separate"/>
-            </w:r>
-            <w:r>
-              <w:rPr>
-                <w:noProof/>
-                <w:webHidden/>
-              </w:rPr>
               <w:t>5</w:t>
-            </w:r>
-            <w:r>
-              <w:rPr>
-                <w:noProof/>
-                <w:webHidden/>
-              </w:rPr>
               <w:fldChar w:fldCharType="end"/>
             </w:r>
           </w:hyperlink>
@@ -3525,46 +3153,10 @@
                 <w:webHidden/>
               </w:rPr>
               <w:tab/>
-            </w:r>
-            <w:r>
-              <w:rPr>
-                <w:noProof/>
-                <w:webHidden/>
-              </w:rPr>
               <w:fldChar w:fldCharType="begin"/>
-            </w:r>
-            <w:r>
-              <w:rPr>
-                <w:noProof/>
-                <w:webHidden/>
-              </w:rPr>
               <w:instrText xml:space="preserve"> PAGEREF _Toc156287342 \h </w:instrText>
-            </w:r>
-            <w:r>
-              <w:rPr>
-                <w:noProof/>
-                <w:webHidden/>
-              </w:rPr>
-            </w:r>
-            <w:r>
-              <w:rPr>
-                <w:noProof/>
-                <w:webHidden/>
-              </w:rPr>
               <w:fldChar w:fldCharType="separate"/>
-            </w:r>
-            <w:r>
-              <w:rPr>
-                <w:noProof/>
-                <w:webHidden/>
-              </w:rPr>
               <w:t>6</w:t>
-            </w:r>
-            <w:r>
-              <w:rPr>
-                <w:noProof/>
-                <w:webHidden/>
-              </w:rPr>
               <w:fldChar w:fldCharType="end"/>
             </w:r>
           </w:hyperlink>
@@ -3619,46 +3211,10 @@
                 <w:webHidden/>
               </w:rPr>
               <w:tab/>
-            </w:r>
-            <w:r>
-              <w:rPr>
-                <w:noProof/>
-                <w:webHidden/>
-              </w:rPr>
               <w:fldChar w:fldCharType="begin"/>
-            </w:r>
-            <w:r>
-              <w:rPr>
-                <w:noProof/>
-                <w:webHidden/>
-              </w:rPr>
               <w:instrText xml:space="preserve"> PAGEREF _Toc156287343 \h </w:instrText>
-            </w:r>
-            <w:r>
-              <w:rPr>
-                <w:noProof/>
-                <w:webHidden/>
-              </w:rPr>
-            </w:r>
-            <w:r>
-              <w:rPr>
-                <w:noProof/>
-                <w:webHidden/>
-              </w:rPr>
               <w:fldChar w:fldCharType="separate"/>
-            </w:r>
-            <w:r>
-              <w:rPr>
-                <w:noProof/>
-                <w:webHidden/>
-              </w:rPr>
               <w:t>6</w:t>
-            </w:r>
-            <w:r>
-              <w:rPr>
-                <w:noProof/>
-                <w:webHidden/>
-              </w:rPr>
               <w:fldChar w:fldCharType="end"/>
             </w:r>
           </w:hyperlink>
@@ -3709,46 +3265,10 @@
                 <w:webHidden/>
               </w:rPr>
               <w:tab/>
-            </w:r>
-            <w:r>
-              <w:rPr>
-                <w:noProof/>
-                <w:webHidden/>
-              </w:rPr>
               <w:fldChar w:fldCharType="begin"/>
-            </w:r>
-            <w:r>
-              <w:rPr>
-                <w:noProof/>
-                <w:webHidden/>
-              </w:rPr>
               <w:instrText xml:space="preserve"> PAGEREF _Toc156287344 \h </w:instrText>
-            </w:r>
-            <w:r>
-              <w:rPr>
-                <w:noProof/>
-                <w:webHidden/>
-              </w:rPr>
-            </w:r>
-            <w:r>
-              <w:rPr>
-                <w:noProof/>
-                <w:webHidden/>
-              </w:rPr>
               <w:fldChar w:fldCharType="separate"/>
-            </w:r>
-            <w:r>
-              <w:rPr>
-                <w:noProof/>
-                <w:webHidden/>
-              </w:rPr>
               <w:t>6</w:t>
-            </w:r>
-            <w:r>
-              <w:rPr>
-                <w:noProof/>
-                <w:webHidden/>
-              </w:rPr>
               <w:fldChar w:fldCharType="end"/>
             </w:r>
           </w:hyperlink>
@@ -3799,46 +3319,10 @@
                 <w:webHidden/>
               </w:rPr>
               <w:tab/>
-            </w:r>
-            <w:r>
-              <w:rPr>
-                <w:noProof/>
-                <w:webHidden/>
-              </w:rPr>
               <w:fldChar w:fldCharType="begin"/>
-            </w:r>
-            <w:r>
-              <w:rPr>
-                <w:noProof/>
-                <w:webHidden/>
-              </w:rPr>
               <w:instrText xml:space="preserve"> PAGEREF _Toc156287345 \h </w:instrText>
-            </w:r>
-            <w:r>
-              <w:rPr>
-                <w:noProof/>
-                <w:webHidden/>
-              </w:rPr>
-            </w:r>
-            <w:r>
-              <w:rPr>
-                <w:noProof/>
-                <w:webHidden/>
-              </w:rPr>
               <w:fldChar w:fldCharType="separate"/>
-            </w:r>
-            <w:r>
-              <w:rPr>
-                <w:noProof/>
-                <w:webHidden/>
-              </w:rPr>
               <w:t>6</w:t>
-            </w:r>
-            <w:r>
-              <w:rPr>
-                <w:noProof/>
-                <w:webHidden/>
-              </w:rPr>
               <w:fldChar w:fldCharType="end"/>
             </w:r>
           </w:hyperlink>
@@ -3906,46 +3390,10 @@
                 <w:webHidden/>
               </w:rPr>
               <w:tab/>
-            </w:r>
-            <w:r>
-              <w:rPr>
-                <w:noProof/>
-                <w:webHidden/>
-              </w:rPr>
               <w:fldChar w:fldCharType="begin"/>
-            </w:r>
-            <w:r>
-              <w:rPr>
-                <w:noProof/>
-                <w:webHidden/>
-              </w:rPr>
               <w:instrText xml:space="preserve"> PAGEREF _Toc156287346 \h </w:instrText>
-            </w:r>
-            <w:r>
-              <w:rPr>
-                <w:noProof/>
-                <w:webHidden/>
-              </w:rPr>
-            </w:r>
-            <w:r>
-              <w:rPr>
-                <w:noProof/>
-                <w:webHidden/>
-              </w:rPr>
               <w:fldChar w:fldCharType="separate"/>
-            </w:r>
-            <w:r>
-              <w:rPr>
-                <w:noProof/>
-                <w:webHidden/>
-              </w:rPr>
               <w:t>7</w:t>
-            </w:r>
-            <w:r>
-              <w:rPr>
-                <w:noProof/>
-                <w:webHidden/>
-              </w:rPr>
               <w:fldChar w:fldCharType="end"/>
             </w:r>
           </w:hyperlink>
@@ -3996,46 +3444,10 @@
                 <w:webHidden/>
               </w:rPr>
               <w:tab/>
-            </w:r>
-            <w:r>
-              <w:rPr>
-                <w:noProof/>
-                <w:webHidden/>
-              </w:rPr>
               <w:fldChar w:fldCharType="begin"/>
-            </w:r>
-            <w:r>
-              <w:rPr>
-                <w:noProof/>
-                <w:webHidden/>
-              </w:rPr>
               <w:instrText xml:space="preserve"> PAGEREF _Toc156287347 \h </w:instrText>
-            </w:r>
-            <w:r>
-              <w:rPr>
-                <w:noProof/>
-                <w:webHidden/>
-              </w:rPr>
-            </w:r>
-            <w:r>
-              <w:rPr>
-                <w:noProof/>
-                <w:webHidden/>
-              </w:rPr>
               <w:fldChar w:fldCharType="separate"/>
-            </w:r>
-            <w:r>
-              <w:rPr>
-                <w:noProof/>
-                <w:webHidden/>
-              </w:rPr>
               <w:t>8</w:t>
-            </w:r>
-            <w:r>
-              <w:rPr>
-                <w:noProof/>
-                <w:webHidden/>
-              </w:rPr>
               <w:fldChar w:fldCharType="end"/>
             </w:r>
           </w:hyperlink>
@@ -4090,46 +3502,10 @@
                 <w:webHidden/>
               </w:rPr>
               <w:tab/>
-            </w:r>
-            <w:r>
-              <w:rPr>
-                <w:noProof/>
-                <w:webHidden/>
-              </w:rPr>
               <w:fldChar w:fldCharType="begin"/>
-            </w:r>
-            <w:r>
-              <w:rPr>
-                <w:noProof/>
-                <w:webHidden/>
-              </w:rPr>
               <w:instrText xml:space="preserve"> PAGEREF _Toc156287348 \h </w:instrText>
-            </w:r>
-            <w:r>
-              <w:rPr>
-                <w:noProof/>
-                <w:webHidden/>
-              </w:rPr>
-            </w:r>
-            <w:r>
-              <w:rPr>
-                <w:noProof/>
-                <w:webHidden/>
-              </w:rPr>
               <w:fldChar w:fldCharType="separate"/>
-            </w:r>
-            <w:r>
-              <w:rPr>
-                <w:noProof/>
-                <w:webHidden/>
-              </w:rPr>
               <w:t>8</w:t>
-            </w:r>
-            <w:r>
-              <w:rPr>
-                <w:noProof/>
-                <w:webHidden/>
-              </w:rPr>
               <w:fldChar w:fldCharType="end"/>
             </w:r>
           </w:hyperlink>
@@ -4201,46 +3577,10 @@
                 <w:webHidden/>
               </w:rPr>
               <w:tab/>
-            </w:r>
-            <w:r>
-              <w:rPr>
-                <w:noProof/>
-                <w:webHidden/>
-              </w:rPr>
               <w:fldChar w:fldCharType="begin"/>
-            </w:r>
-            <w:r>
-              <w:rPr>
-                <w:noProof/>
-                <w:webHidden/>
-              </w:rPr>
               <w:instrText xml:space="preserve"> PAGEREF _Toc156287349 \h </w:instrText>
-            </w:r>
-            <w:r>
-              <w:rPr>
-                <w:noProof/>
-                <w:webHidden/>
-              </w:rPr>
-            </w:r>
-            <w:r>
-              <w:rPr>
-                <w:noProof/>
-                <w:webHidden/>
-              </w:rPr>
               <w:fldChar w:fldCharType="separate"/>
-            </w:r>
-            <w:r>
-              <w:rPr>
-                <w:noProof/>
-                <w:webHidden/>
-              </w:rPr>
               <w:t>9</w:t>
-            </w:r>
-            <w:r>
-              <w:rPr>
-                <w:noProof/>
-                <w:webHidden/>
-              </w:rPr>
               <w:fldChar w:fldCharType="end"/>
             </w:r>
           </w:hyperlink>
@@ -4312,46 +3652,10 @@
                 <w:webHidden/>
               </w:rPr>
               <w:tab/>
-            </w:r>
-            <w:r>
-              <w:rPr>
-                <w:noProof/>
-                <w:webHidden/>
-              </w:rPr>
               <w:fldChar w:fldCharType="begin"/>
-            </w:r>
-            <w:r>
-              <w:rPr>
-                <w:noProof/>
-                <w:webHidden/>
-              </w:rPr>
               <w:instrText xml:space="preserve"> PAGEREF _Toc156287350 \h </w:instrText>
-            </w:r>
-            <w:r>
-              <w:rPr>
-                <w:noProof/>
-                <w:webHidden/>
-              </w:rPr>
-            </w:r>
-            <w:r>
-              <w:rPr>
-                <w:noProof/>
-                <w:webHidden/>
-              </w:rPr>
               <w:fldChar w:fldCharType="separate"/>
-            </w:r>
-            <w:r>
-              <w:rPr>
-                <w:noProof/>
-                <w:webHidden/>
-              </w:rPr>
               <w:t>9</w:t>
-            </w:r>
-            <w:r>
-              <w:rPr>
-                <w:noProof/>
-                <w:webHidden/>
-              </w:rPr>
               <w:fldChar w:fldCharType="end"/>
             </w:r>
           </w:hyperlink>
@@ -4402,46 +3706,10 @@
                 <w:webHidden/>
               </w:rPr>
               <w:tab/>
-            </w:r>
-            <w:r>
-              <w:rPr>
-                <w:noProof/>
-                <w:webHidden/>
-              </w:rPr>
               <w:fldChar w:fldCharType="begin"/>
-            </w:r>
-            <w:r>
-              <w:rPr>
-                <w:noProof/>
-                <w:webHidden/>
-              </w:rPr>
               <w:instrText xml:space="preserve"> PAGEREF _Toc156287351 \h </w:instrText>
-            </w:r>
-            <w:r>
-              <w:rPr>
-                <w:noProof/>
-                <w:webHidden/>
-              </w:rPr>
-            </w:r>
-            <w:r>
-              <w:rPr>
-                <w:noProof/>
-                <w:webHidden/>
-              </w:rPr>
               <w:fldChar w:fldCharType="separate"/>
-            </w:r>
-            <w:r>
-              <w:rPr>
-                <w:noProof/>
-                <w:webHidden/>
-              </w:rPr>
               <w:t>10</w:t>
-            </w:r>
-            <w:r>
-              <w:rPr>
-                <w:noProof/>
-                <w:webHidden/>
-              </w:rPr>
               <w:fldChar w:fldCharType="end"/>
             </w:r>
           </w:hyperlink>
@@ -4492,46 +3760,10 @@
                 <w:webHidden/>
               </w:rPr>
               <w:tab/>
-            </w:r>
-            <w:r>
-              <w:rPr>
-                <w:noProof/>
-                <w:webHidden/>
-              </w:rPr>
               <w:fldChar w:fldCharType="begin"/>
-            </w:r>
-            <w:r>
-              <w:rPr>
-                <w:noProof/>
-                <w:webHidden/>
-              </w:rPr>
               <w:instrText xml:space="preserve"> PAGEREF _Toc156287352 \h </w:instrText>
-            </w:r>
-            <w:r>
-              <w:rPr>
-                <w:noProof/>
-                <w:webHidden/>
-              </w:rPr>
-            </w:r>
-            <w:r>
-              <w:rPr>
-                <w:noProof/>
-                <w:webHidden/>
-              </w:rPr>
               <w:fldChar w:fldCharType="separate"/>
-            </w:r>
-            <w:r>
-              <w:rPr>
-                <w:noProof/>
-                <w:webHidden/>
-              </w:rPr>
               <w:t>10</w:t>
-            </w:r>
-            <w:r>
-              <w:rPr>
-                <w:noProof/>
-                <w:webHidden/>
-              </w:rPr>
               <w:fldChar w:fldCharType="end"/>
             </w:r>
           </w:hyperlink>
@@ -4582,46 +3814,10 @@
                 <w:webHidden/>
               </w:rPr>
               <w:tab/>
-            </w:r>
-            <w:r>
-              <w:rPr>
-                <w:noProof/>
-                <w:webHidden/>
-              </w:rPr>
               <w:fldChar w:fldCharType="begin"/>
-            </w:r>
-            <w:r>
-              <w:rPr>
-                <w:noProof/>
-                <w:webHidden/>
-              </w:rPr>
               <w:instrText xml:space="preserve"> PAGEREF _Toc156287353 \h </w:instrText>
-            </w:r>
-            <w:r>
-              <w:rPr>
-                <w:noProof/>
-                <w:webHidden/>
-              </w:rPr>
-            </w:r>
-            <w:r>
-              <w:rPr>
-                <w:noProof/>
-                <w:webHidden/>
-              </w:rPr>
               <w:fldChar w:fldCharType="separate"/>
-            </w:r>
-            <w:r>
-              <w:rPr>
-                <w:noProof/>
-                <w:webHidden/>
-              </w:rPr>
               <w:t>10</w:t>
-            </w:r>
-            <w:r>
-              <w:rPr>
-                <w:noProof/>
-                <w:webHidden/>
-              </w:rPr>
               <w:fldChar w:fldCharType="end"/>
             </w:r>
           </w:hyperlink>
@@ -4676,46 +3872,10 @@
                 <w:webHidden/>
               </w:rPr>
               <w:tab/>
-            </w:r>
-            <w:r>
-              <w:rPr>
-                <w:noProof/>
-                <w:webHidden/>
-              </w:rPr>
               <w:fldChar w:fldCharType="begin"/>
-            </w:r>
-            <w:r>
-              <w:rPr>
-                <w:noProof/>
-                <w:webHidden/>
-              </w:rPr>
               <w:instrText xml:space="preserve"> PAGEREF _Toc156287354 \h </w:instrText>
-            </w:r>
-            <w:r>
-              <w:rPr>
-                <w:noProof/>
-                <w:webHidden/>
-              </w:rPr>
-            </w:r>
-            <w:r>
-              <w:rPr>
-                <w:noProof/>
-                <w:webHidden/>
-              </w:rPr>
               <w:fldChar w:fldCharType="separate"/>
-            </w:r>
-            <w:r>
-              <w:rPr>
-                <w:noProof/>
-                <w:webHidden/>
-              </w:rPr>
               <w:t>11</w:t>
-            </w:r>
-            <w:r>
-              <w:rPr>
-                <w:noProof/>
-                <w:webHidden/>
-              </w:rPr>
               <w:fldChar w:fldCharType="end"/>
             </w:r>
           </w:hyperlink>
@@ -4766,46 +3926,10 @@
                 <w:webHidden/>
               </w:rPr>
               <w:tab/>
-            </w:r>
-            <w:r>
-              <w:rPr>
-                <w:noProof/>
-                <w:webHidden/>
-              </w:rPr>
               <w:fldChar w:fldCharType="begin"/>
-            </w:r>
-            <w:r>
-              <w:rPr>
-                <w:noProof/>
-                <w:webHidden/>
-              </w:rPr>
               <w:instrText xml:space="preserve"> PAGEREF _Toc156287355 \h </w:instrText>
-            </w:r>
-            <w:r>
-              <w:rPr>
-                <w:noProof/>
-                <w:webHidden/>
-              </w:rPr>
-            </w:r>
-            <w:r>
-              <w:rPr>
-                <w:noProof/>
-                <w:webHidden/>
-              </w:rPr>
               <w:fldChar w:fldCharType="separate"/>
-            </w:r>
-            <w:r>
-              <w:rPr>
-                <w:noProof/>
-                <w:webHidden/>
-              </w:rPr>
               <w:t>11</w:t>
-            </w:r>
-            <w:r>
-              <w:rPr>
-                <w:noProof/>
-                <w:webHidden/>
-              </w:rPr>
               <w:fldChar w:fldCharType="end"/>
             </w:r>
           </w:hyperlink>
@@ -4856,46 +3980,10 @@
                 <w:webHidden/>
               </w:rPr>
               <w:tab/>
-            </w:r>
-            <w:r>
-              <w:rPr>
-                <w:noProof/>
-                <w:webHidden/>
-              </w:rPr>
               <w:fldChar w:fldCharType="begin"/>
-            </w:r>
-            <w:r>
-              <w:rPr>
-                <w:noProof/>
-                <w:webHidden/>
-              </w:rPr>
               <w:instrText xml:space="preserve"> PAGEREF _Toc156287356 \h </w:instrText>
-            </w:r>
-            <w:r>
-              <w:rPr>
-                <w:noProof/>
-                <w:webHidden/>
-              </w:rPr>
-            </w:r>
-            <w:r>
-              <w:rPr>
-                <w:noProof/>
-                <w:webHidden/>
-              </w:rPr>
               <w:fldChar w:fldCharType="separate"/>
-            </w:r>
-            <w:r>
-              <w:rPr>
-                <w:noProof/>
-                <w:webHidden/>
-              </w:rPr>
               <w:t>11</w:t>
-            </w:r>
-            <w:r>
-              <w:rPr>
-                <w:noProof/>
-                <w:webHidden/>
-              </w:rPr>
               <w:fldChar w:fldCharType="end"/>
             </w:r>
           </w:hyperlink>
@@ -4946,46 +4034,10 @@
                 <w:webHidden/>
               </w:rPr>
               <w:tab/>
-            </w:r>
-            <w:r>
-              <w:rPr>
-                <w:noProof/>
-                <w:webHidden/>
-              </w:rPr>
               <w:fldChar w:fldCharType="begin"/>
-            </w:r>
-            <w:r>
-              <w:rPr>
-                <w:noProof/>
-                <w:webHidden/>
-              </w:rPr>
               <w:instrText xml:space="preserve"> PAGEREF _Toc156287357 \h </w:instrText>
-            </w:r>
-            <w:r>
-              <w:rPr>
-                <w:noProof/>
-                <w:webHidden/>
-              </w:rPr>
-            </w:r>
-            <w:r>
-              <w:rPr>
-                <w:noProof/>
-                <w:webHidden/>
-              </w:rPr>
               <w:fldChar w:fldCharType="separate"/>
-            </w:r>
-            <w:r>
-              <w:rPr>
-                <w:noProof/>
-                <w:webHidden/>
-              </w:rPr>
               <w:t>11</w:t>
-            </w:r>
-            <w:r>
-              <w:rPr>
-                <w:noProof/>
-                <w:webHidden/>
-              </w:rPr>
               <w:fldChar w:fldCharType="end"/>
             </w:r>
           </w:hyperlink>
@@ -5040,46 +4092,10 @@
                 <w:webHidden/>
               </w:rPr>
               <w:tab/>
-            </w:r>
-            <w:r>
-              <w:rPr>
-                <w:noProof/>
-                <w:webHidden/>
-              </w:rPr>
               <w:fldChar w:fldCharType="begin"/>
-            </w:r>
-            <w:r>
-              <w:rPr>
-                <w:noProof/>
-                <w:webHidden/>
-              </w:rPr>
               <w:instrText xml:space="preserve"> PAGEREF _Toc156287358 \h </w:instrText>
-            </w:r>
-            <w:r>
-              <w:rPr>
-                <w:noProof/>
-                <w:webHidden/>
-              </w:rPr>
-            </w:r>
-            <w:r>
-              <w:rPr>
-                <w:noProof/>
-                <w:webHidden/>
-              </w:rPr>
               <w:fldChar w:fldCharType="separate"/>
-            </w:r>
-            <w:r>
-              <w:rPr>
-                <w:noProof/>
-                <w:webHidden/>
-              </w:rPr>
               <w:t>11</w:t>
-            </w:r>
-            <w:r>
-              <w:rPr>
-                <w:noProof/>
-                <w:webHidden/>
-              </w:rPr>
               <w:fldChar w:fldCharType="end"/>
             </w:r>
           </w:hyperlink>
@@ -5179,8 +4195,6 @@
           <w:color w:val="404040"/>
         </w:rPr>
       </w:pPr>
-      <w:proofErr w:type="spellStart"/>
-      <w:proofErr w:type="spellEnd"/>
       <w:r>
         <w:rPr>
           <w:bCs/>
@@ -5193,16 +4207,7 @@
           <w:bCs/>
           <w:color w:val="404040"/>
         </w:rPr>
-        <w:t xml:space="preserve"> </w:t>
-      </w:r>
-      <w:proofErr w:type="spellStart"/>
-      <w:proofErr w:type="spellEnd"/>
-      <w:r>
-        <w:rPr>
-          <w:bCs/>
-          <w:color w:val="404040"/>
-        </w:rPr>
-        <w:t>will act as the data manager who will be in charge of the actions described by this DMP.</w:t>
+        <w:t xml:space="preserve"> will act as the data manager who will be in charge of the actions described by this DMP.</w:t>
       </w:r>
     </w:p>
     <w:p>
@@ -5953,13 +4958,10 @@
           <w:color w:val="auto"/>
         </w:rPr>
       </w:pPr>
-      <w:proofErr w:type="spellStart"/>
-      <w:proofErr w:type="spellEnd"/>
       <w:r>
         <w:rPr>
           <w:color w:val="auto"/>
         </w:rPr>
-        <w:t/>
         <w:t>Description for "Frost Day Prediction Random Forest Model":</w:t>
         <w:br/>
         <w:br/>
@@ -5978,8 +4980,6 @@
           <w:color w:val="auto"/>
         </w:rPr>
       </w:pPr>
-      <w:proofErr w:type="spellStart"/>
-      <w:proofErr w:type="spellEnd"/>
       <w:r>
         <w:rPr>
           <w:color w:val="auto"/>
@@ -6274,7 +5274,7 @@
                 <w:sz w:val="18"/>
                 <w:szCs w:val="18"/>
               </w:rPr>
-              <w:t/>
+              <w:t>CC0</w:t>
             </w:r>
           </w:p>
         </w:tc>
@@ -6308,10 +5308,7 @@
         <w:jc w:val="left"/>
       </w:pPr>
       <w:bookmarkStart w:id="12" w:name="_Toc156287341"/>
-      <w:proofErr w:type="spellStart"/>
-      <w:proofErr w:type="spellEnd"/>
-      <w:r>
-        <w:t/>
+      <w:r>
         <w:t>Description for "Messstationen Tagesdaten v2 (Daily Station Measurements)":</w:t>
         <w:br/>
         <w:br/>
@@ -6336,8 +5333,6 @@
           <w:bCs/>
         </w:rPr>
       </w:pPr>
-      <w:proofErr w:type="spellStart"/>
-      <w:proofErr w:type="spellEnd"/>
       <w:r>
         <w:rPr>
           <w:rFonts w:eastAsiaTheme="minorEastAsia"/>
@@ -6364,8 +5359,6 @@
           <w:color w:val="000000" w:themeColor="text1"/>
         </w:rPr>
       </w:pPr>
-      <w:proofErr w:type="spellStart"/>
-      <w:proofErr w:type="spellEnd"/>
       <w:r>
         <w:t>The primary target audience includes meteorologists, climate scientists, and data scientists interested in weather prediction and frost day analysis for the Vienna region. The dataset and experiment may also be of interest to urban planners, agricultural researchers, and public health professionals who need to anticipate frost events. Additionally, educators and students in data science and machine learning courses may find the experiment useful as a reproducible example of a FAIR-compliant open-science workflow. The CC0 licence on the input data and MIT licence on the code place no restrictions on reuse.</w:t>
       </w:r>
@@ -6517,26 +5510,10 @@
     </w:p>
     <w:p>
       <w:r>
-        <w:t xml:space="preserve">We will make our data findable by uploading it to a data repository that provides a persistent </w:t>
-      </w:r>
-      <w:proofErr w:type="gramStart"/>
-      <w:r>
-        <w:t>identifier, and</w:t>
-      </w:r>
-      <w:proofErr w:type="gramEnd"/>
-      <w:r>
-        <w:t xml:space="preserve"> adding relevant metadata.</w:t>
-      </w:r>
-      <w:r>
-        <w:t xml:space="preserve"> </w:t>
-      </w:r>
-      <w:r>
-        <w:t>The repository will provide means for harvesting the metadata, including its machine-actionable representation.</w:t>
-      </w:r>
-    </w:p>
-    <w:p>
-      <w:proofErr w:type="spellStart"/>
-      <w:proofErr w:type="spellEnd"/>
+        <w:t>We will make our data findable by uploading it to a data repository that provides a persistent identifier, and adding relevant metadata. The repository will provide means for harvesting the metadata, including its machine-actionable representation.</w:t>
+      </w:r>
+    </w:p>
+    <w:p>
       <w:r>
         <w:t>The input data is stored in a relational database in DBRepo following a Third Normal Form (3NF) schema consisting of two tables: station (station metadata) and daily_observation (daily meteorological measurements). The schema includes primary and foreign key constraints to ensure data integrity.
 All code, notebooks, and configuration files are version-controlled in a public GitHub repository using Git. A consistent file-naming convention is applied covering input datasets, output files, scripts and configuration files, documented in the README. GitHub releases are used to create versioned snapshots of the experiment at key milestones. The repository is connected to Zenodo for automatic DOI minting upon each release, ensuring persistent and citable versions of the software.
@@ -6554,24 +5531,12 @@
     <w:p>
       <w:bookmarkStart w:id="19" w:name="_Toc123731435"/>
       <w:r>
-        <w:t xml:space="preserve">Additionally, we will provide common metadata such as title, description, or keywords when publishing data. In </w:t>
-      </w:r>
-      <w:r>
-        <w:t>this</w:t>
-      </w:r>
-      <w:r>
-        <w:t xml:space="preserve"> case, we will follow the default template provided by the repository, such as Data Cite Metadata or Dublin Core.</w:t>
-      </w:r>
-    </w:p>
-    <w:p>
-      <w:r>
-        <w:t>A</w:t>
-      </w:r>
-      <w:r>
-        <w:t>s</w:t>
-      </w:r>
-      <w:r>
-        <w:t xml:space="preserve"> far as possible, we will use controlled vocabularies for our data to allow inter-disciplinary interoperability and machine-actionability.</w:t>
+        <w:t>Additionally, we will provide common metadata such as title, description, or keywords when publishing data. In this case, we will follow the default template provided by the repository, such as Data Cite Metadata or Dublin Core.</w:t>
+      </w:r>
+    </w:p>
+    <w:p>
+      <w:r>
+        <w:t>As far as possible, we will use controlled vocabularies for our data to allow inter-disciplinary interoperability and machine-actionability.</w:t>
       </w:r>
     </w:p>
     <w:p>
@@ -6751,12 +5716,6 @@
           <w:lang w:val="en-GB"/>
         </w:rPr>
         <w:t>Will all data be made openly available? If certain datasets cannot be shared (or need to be shared under restricted access conditions), explain why, clearly separating legal and contractual reasons from intentional restrictions. Note that in multi-</w:t>
-      </w:r>
-      <w:r>
-        <w:rPr>
-          <w:color w:val="auto"/>
-          <w:lang w:val="en-GB"/>
-        </w:rPr>
         <w:lastRenderedPageBreak/>
         <w:t>beneficiary projects it is also possible for specific beneficiaries to keep their data closed if opening their data goes against their legitimate interests or other constraints as per the Grant Agreement.</w:t>
       </w:r>
@@ -6923,23 +5882,13 @@
           <w:color w:val="auto"/>
         </w:rPr>
       </w:pPr>
-      <w:proofErr w:type="spellStart"/>
       <w:r>
         <w:rPr>
           <w:b/>
           <w:bCs/>
           <w:color w:val="auto"/>
         </w:rPr>
-        <w:t>Metadata</w:t>
-      </w:r>
-      <w:proofErr w:type="spellEnd"/>
-      <w:r>
-        <w:rPr>
-          <w:b/>
-          <w:bCs/>
-          <w:color w:val="auto"/>
-        </w:rPr>
-        <w:t>:</w:t>
+        <w:t>Metadata:</w:t>
       </w:r>
     </w:p>
     <w:p>
@@ -7026,31 +5975,12 @@
           <w:color w:val="auto"/>
           <w:lang w:val="en-GB"/>
         </w:rPr>
-        <w:t xml:space="preserve">Will documentation or reference about any software be needed to access or read the data be included? Will it be possible to include the relevant software (e.g. in </w:t>
-      </w:r>
-      <w:proofErr w:type="gramStart"/>
-      <w:r>
-        <w:rPr>
-          <w:color w:val="auto"/>
-          <w:lang w:val="en-GB"/>
-        </w:rPr>
-        <w:t>open source</w:t>
-      </w:r>
-      <w:proofErr w:type="gramEnd"/>
-      <w:r>
-        <w:rPr>
-          <w:color w:val="auto"/>
-          <w:lang w:val="en-GB"/>
-        </w:rPr>
-        <w:t xml:space="preserve"> code)?</w:t>
-      </w:r>
-    </w:p>
-    <w:p>
-      <w:r>
-        <w:t>We will make our data accessible by providing open access to data, wherever possible. In cases where open access is not possible, we will provide meaningful metadata plus contact information for access requests.</w:t>
-      </w:r>
-      <w:r>
-        <w:t xml:space="preserve"> Some datasets cannot be published and even need to be deleted at the end of the project. See section 5 for more details.</w:t>
+        <w:t>Will documentation or reference about any software be needed to access or read the data be included? Will it be possible to include the relevant software (e.g. in open source code)?</w:t>
+      </w:r>
+    </w:p>
+    <w:p>
+      <w:r>
+        <w:t>We will make our data accessible by providing open access to data, wherever possible. In cases where open access is not possible, we will provide meaningful metadata plus contact information for access requests. Some datasets cannot be published and even need to be deleted at the end of the project. See section 5 for more details.</w:t>
       </w:r>
     </w:p>
     <w:tbl>
@@ -7658,8 +6588,6 @@
       <w:pPr>
         <w:spacing w:before="240"/>
       </w:pPr>
-      <w:proofErr w:type="spellStart"/>
-      <w:proofErr w:type="spellEnd"/>
       <w:r>
         <w:t/>
       </w:r>
@@ -7669,10 +6597,7 @@
         <w:spacing w:before="240"/>
         <w:jc w:val="left"/>
       </w:pPr>
-      <w:proofErr w:type="spellStart"/>
-      <w:proofErr w:type="spellEnd"/>
-      <w:r>
-        <w:t/>
+      <w:r>
         <w:t>Repository description:</w:t>
         <w:br/>
         <w:br/>
@@ -7689,8 +6614,6 @@
       </w:r>
     </w:p>
     <w:p>
-      <w:proofErr w:type="spellStart"/>
-      <w:proofErr w:type="spellEnd"/>
       <w:r>
         <w:t/>
       </w:r>
@@ -7807,19 +6730,7 @@
     <w:p>
       <w:bookmarkStart w:id="23" w:name="_Toc123731437"/>
       <w:r>
-        <w:t xml:space="preserve">We will make our data interoperable by providing and describing data in a way that is common within our domain. </w:t>
-      </w:r>
-      <w:r>
-        <w:t>A</w:t>
-      </w:r>
-      <w:r>
-        <w:t>s</w:t>
-      </w:r>
-      <w:r>
-        <w:t xml:space="preserve"> far as possible, we will use controlled vocabularies for our data to allow inter-disciplinary interoperability and machine-actionability. </w:t>
-      </w:r>
-      <w:r>
-        <w:t>We will provide good documentation for all our datasets.</w:t>
+        <w:t>We will make our data interoperable by providing and describing data in a way that is common within our domain. As far as possible, we will use controlled vocabularies for our data to allow inter-disciplinary interoperability and machine-actionability. We will provide good documentation for all our datasets.</w:t>
       </w:r>
     </w:p>
     <w:p>
@@ -7917,23 +6828,7 @@
           <w:color w:val="auto"/>
           <w:lang w:val="en-GB"/>
         </w:rPr>
-        <w:t xml:space="preserve">Will the data produced in the project be useable by third parties, </w:t>
-      </w:r>
-      <w:proofErr w:type="gramStart"/>
-      <w:r>
-        <w:rPr>
-          <w:color w:val="auto"/>
-          <w:lang w:val="en-GB"/>
-        </w:rPr>
-        <w:t>in particular after</w:t>
-      </w:r>
-      <w:proofErr w:type="gramEnd"/>
-      <w:r>
-        <w:rPr>
-          <w:color w:val="auto"/>
-          <w:lang w:val="en-GB"/>
-        </w:rPr>
-        <w:t xml:space="preserve"> the end of the project?</w:t>
+        <w:t>Will the data produced in the project be useable by third parties, in particular after the end of the project?</w:t>
       </w:r>
     </w:p>
     <w:p>
@@ -8025,15 +6920,7 @@
     </w:p>
     <w:p>
       <w:r>
-        <w:t xml:space="preserve">We will make our data reusable by adding metadata and comprehensive Readme files to all published datasets. The descriptions will include details on the methodology used, analytical, and procedural information. In case of publication, licenses for code and data will always be assigned and clearly marked. The digital research data obtained will be published Open Access under a Creative Commons CC BY license, </w:t>
-      </w:r>
-      <w:proofErr w:type="gramStart"/>
-      <w:r>
-        <w:t>provided that</w:t>
-      </w:r>
-      <w:proofErr w:type="gramEnd"/>
-      <w:r>
-        <w:t xml:space="preserve"> there are no data protection concerns.</w:t>
+        <w:t>We will make our data reusable by adding metadata and comprehensive Readme files to all published datasets. The descriptions will include details on the methodology used, analytical, and procedural information. In case of publication, licenses for code and data will always be assigned and clearly marked. The digital research data obtained will be published Open Access under a Creative Commons CC BY license, provided that there are no data protection concerns.</w:t>
       </w:r>
     </w:p>
     <w:p>
@@ -8049,8 +6936,6 @@
       <w:pPr>
         <w:ind w:right="243"/>
       </w:pPr>
-      <w:proofErr w:type="spellStart"/>
-      <w:proofErr w:type="spellEnd"/>
       <w:r>
         <w:t>The following data quality checks will be done: standardised data capture, data entry validation, representation with controlled vocabularies and The input data is obtained from GeoSphere Austria, an official national meteorological service, ensuring high quality and scientific reliability. The dataset is publicly available under a CC0 licence and listed in re3data, confirming it meets open data standards.
 Data quality control measures applied during processing include: identification and handling of missing values (represented as -1 in the original CSV, converted to NULL during loading into DBRepo), removal of rows with invalid or incomplete measurements, and verification of data types and value ranges during import.
@@ -8304,8 +7189,6 @@
           <w:lang w:val="en-GB"/>
         </w:rPr>
       </w:pPr>
-      <w:proofErr w:type="spellStart"/>
-      <w:proofErr w:type="spellEnd"/>
       <w:r>
         <w:rPr>
           <w:rFonts w:eastAsiaTheme="minorEastAsia"/>
@@ -8314,8 +7197,6 @@
         </w:rPr>
         <w:t/>
       </w:r>
-      <w:proofErr w:type="spellStart"/>
-      <w:proofErr w:type="spellEnd"/>
       <w:r>
         <w:rPr>
           <w:rFonts w:eastAsiaTheme="minorEastAsia"/>
@@ -8336,33 +7217,7 @@
         <w:rPr>
           <w:color w:val="auto"/>
         </w:rPr>
-        <w:t>The data manager will direct the data management process</w:t>
-      </w:r>
-      <w:r>
-        <w:rPr>
-          <w:color w:val="auto"/>
-        </w:rPr>
-        <w:t xml:space="preserve"> </w:t>
-      </w:r>
-      <w:r>
-        <w:rPr>
-          <w:color w:val="auto"/>
-        </w:rPr>
-        <w:t>overall, with</w:t>
-      </w:r>
-      <w:r>
-        <w:rPr>
-          <w:color w:val="auto"/>
-        </w:rPr>
-        <w:t xml:space="preserve"> </w:t>
-      </w:r>
-      <w:proofErr w:type="spellStart"/>
-      <w:proofErr w:type="spellEnd"/>
-      <w:r>
-        <w:rPr>
-          <w:color w:val="auto"/>
-        </w:rPr>
-        <w:t>[the work package leaders] being responsible for ensuring metadata production, day-to-day cross-checks, back-up and other quality control activities are maintained. The researchers will be responsible for routine supervision of the dataset development.</w:t>
+        <w:t>The data manager will direct the data management process overall, with [the work package leaders] being responsible for ensuring metadata production, day-to-day cross-checks, back-up and other quality control activities are maintained. The researchers will be responsible for routine supervision of the dataset development.</w:t>
       </w:r>
     </w:p>
     <w:p>
@@ -8464,14 +7319,12 @@
           <w:lang w:val="en-GB"/>
         </w:rPr>
       </w:pPr>
-      <w:proofErr w:type="spellStart"/>
-      <w:proofErr w:type="spellEnd"/>
       <w:r>
         <w:rPr>
           <w:rFonts w:eastAsiaTheme="minorEastAsia"/>
           <w:lang w:val="en-GB"/>
         </w:rPr>
-        <w:t>For the duration of the project, storage and backup of data will be ensured by Anxhela Sulmina (acting as the person responsible for data management and DMP) in cooperation with the system operator. The data will not be stored on the servers of TU Wien.</w:t>
+        <w:t>For the duration of the project, storage and backup of data will be ensured by Anxhela Sulmina (acting as the person responsible for data management and DMP) in cooperation with the system operator. Data and code are stored in GitHub (version control), DBRepo (structured input data), Zenodo (software archiving), and the TU Wien Research Data Repository (model and output deposits).</w:t>
       </w:r>
     </w:p>
     <w:p>
@@ -8514,8 +7367,6 @@
           <w:lang w:val="en-GB"/>
         </w:rPr>
       </w:pPr>
-      <w:proofErr w:type="spellStart"/>
-      <w:proofErr w:type="spellEnd"/>
       <w:r>
         <w:rPr>
           <w:rFonts w:eastAsiaTheme="minorEastAsia"/>
@@ -9127,15 +7978,6 @@
                 <w:szCs w:val="18"/>
               </w:rPr>
               <w:t>minimum retention period</w:t>
-            </w:r>
-            <w:r>
-              <w:rPr>
-                <w:b/>
-                <w:bCs/>
-                <w:color w:val="000000" w:themeColor="text1"/>
-                <w:sz w:val="18"/>
-                <w:szCs w:val="18"/>
-              </w:rPr>
               <w:br/>
               <w:t>(</w:t>
             </w:r>
@@ -9372,23 +8214,7 @@
           <w:color w:val="000000"/>
           <w:lang w:val="en-GB"/>
         </w:rPr>
-        <w:t>Are there, or could there be, any ethics or legal issues that can have an impact on data sharing? These can also be discussed in the context of the ethics review. If relevant, include references to ethics deliverables and ethics chapter in the Description of the Action (</w:t>
-      </w:r>
-      <w:proofErr w:type="spellStart"/>
-      <w:r>
-        <w:rPr>
-          <w:color w:val="000000"/>
-          <w:lang w:val="en-GB"/>
-        </w:rPr>
-        <w:t>DoA</w:t>
-      </w:r>
-      <w:proofErr w:type="spellEnd"/>
-      <w:r>
-        <w:rPr>
-          <w:color w:val="000000"/>
-          <w:lang w:val="en-GB"/>
-        </w:rPr>
-        <w:t>).</w:t>
+        <w:t>Are there, or could there be, any ethics or legal issues that can have an impact on data sharing? These can also be discussed in the context of the ethics review. If relevant, include references to ethics deliverables and ethics chapter in the Description of the Action (DoA).</w:t>
       </w:r>
     </w:p>
     <w:p>
@@ -9416,23 +8242,7 @@
           <w:color w:val="000000"/>
           <w:lang w:val="en-GB"/>
         </w:rPr>
-        <w:t xml:space="preserve">Will informed consent for data sharing and </w:t>
-      </w:r>
-      <w:proofErr w:type="gramStart"/>
-      <w:r>
-        <w:rPr>
-          <w:color w:val="000000"/>
-          <w:lang w:val="en-GB"/>
-        </w:rPr>
-        <w:t>long term</w:t>
-      </w:r>
-      <w:proofErr w:type="gramEnd"/>
-      <w:r>
-        <w:rPr>
-          <w:color w:val="000000"/>
-          <w:lang w:val="en-GB"/>
-        </w:rPr>
-        <w:t xml:space="preserve"> preservation be included in questionnaires dealing with personal data?</w:t>
+        <w:t>Will informed consent for data sharing and long term preservation be included in questionnaires dealing with personal data?</w:t>
       </w:r>
     </w:p>
     <w:p>
@@ -9448,8 +8258,6 @@
       <w:bookmarkEnd w:id="45"/>
     </w:p>
     <w:p>
-      <w:proofErr w:type="spellStart"/>
-      <w:proofErr w:type="spellEnd"/>
       <w:r>
         <w:t>At this stage, it is not foreseen to process any personal data in the project. If this changes, advice will be sought from the data protection specialist at TU Wien, and the DMP will be updated.</w:t>
       </w:r>
@@ -9463,8 +8271,6 @@
       </w:r>
     </w:p>
     <w:p>
-      <w:proofErr w:type="spellStart"/>
-      <w:proofErr w:type="spellEnd"/>
       <w:r>
         <w:t>The following individual(s) hold rights and control access to the project data: All datasets and research outputs are publicly accessible under open licences. No access restrictions are applied.
 The GitHub repository is owned by the group account datastewgroup4. All four group members (Role A, B, C, D) have collaborator access with write permissions to the repository.
@@ -9487,8 +8293,6 @@
       <w:bookmarkEnd w:id="47"/>
     </w:p>
     <w:p>
-      <w:proofErr w:type="spellStart"/>
-      <w:proofErr w:type="spellEnd"/>
       <w:r>
         <w:t xml:space="preserve">No particular ethical issue is foreseen with the data to be used or produced by the project. This section will be updated if issues arise. </w:t>
       </w:r>

</xml_diff>